<commit_message>
Include Open Gym in group memberships
</commit_message>
<xml_diff>
--- a/docs/BALY-wellness-rules-review-he.docx
+++ b/docs/BALY-wellness-rules-review-he.docx
@@ -2314,7 +2314,7 @@
                 <w:sz w:val="16"/>
                 <w:rtl/>
               </w:rPr>
-              <w:t>לא כברירת מחדל</w:t>
+              <w:t>כן — כלול במנוי</w:t>
             </w:r>
           </w:p>
         </w:tc>
@@ -2471,7 +2471,7 @@
                 <w:sz w:val="16"/>
                 <w:rtl/>
               </w:rPr>
-              <w:t>לא כברירת מחדל</w:t>
+              <w:t>כן — כלול במנוי</w:t>
             </w:r>
           </w:p>
         </w:tc>
@@ -3702,6 +3702,24 @@
           <w:sz w:val="18"/>
           <w:rtl/>
         </w:rPr>
+        <w:t>מנוי קבוצתי חודשי ומנוי קבוצתי שנתי כוללים כניסה ל־Open Gym כחלק מהמנוי, ללא תשלום נוסף.</w:t>
+      </w:r>
+    </w:p>
+    <w:p>
+      <w:pPr>
+        <w:pStyle w:val="ListBullet"/>
+        <w:spacing w:after="50"/>
+        <w:ind w:left="0" w:right="255" w:hanging="142"/>
+        <w:jc w:val="right"/>
+        <w:bidi w:val="1"/>
+      </w:pPr>
+      <w:r>
+        <w:rPr>
+          <w:rFonts w:ascii="Arial" w:hAnsi="Arial" w:cs="Arial"/>
+          <w:color w:val="242621"/>
+          <w:sz w:val="18"/>
+          <w:rtl/>
+        </w:rPr>
         <w:t>נדרש סטטוס תשלום תקין.</w:t>
       </w:r>
     </w:p>
@@ -3755,14 +3773,14 @@
         <w:tc>
           <w:tcPr>
             <w:tcW w:type="dxa" w:w="10080"/>
-            <w:shd w:fill="FBE9E9"/>
+            <w:shd w:fill="E5F3EC"/>
             <w:tcBorders>
-              <w:top w:val="single" w:sz="7" w:color="D99696"/>
-              <w:left w:val="single" w:sz="7" w:color="D99696"/>
-              <w:bottom w:val="single" w:sz="7" w:color="D99696"/>
-              <w:right w:val="single" w:sz="7" w:color="D99696"/>
-              <w:insideH w:val="single" w:sz="7" w:color="D99696"/>
-              <w:insideV w:val="single" w:sz="7" w:color="D99696"/>
+              <w:top w:val="single" w:sz="7" w:color="6EAA8F"/>
+              <w:left w:val="single" w:sz="7" w:color="6EAA8F"/>
+              <w:bottom w:val="single" w:sz="7" w:color="6EAA8F"/>
+              <w:right w:val="single" w:sz="7" w:color="6EAA8F"/>
+              <w:insideH w:val="single" w:sz="7" w:color="6EAA8F"/>
+              <w:insideV w:val="single" w:sz="7" w:color="6EAA8F"/>
             </w:tcBorders>
             <w:vAlign w:val="center"/>
           </w:tcPr>
@@ -3780,7 +3798,7 @@
                 <w:sz w:val="20"/>
                 <w:rtl/>
               </w:rPr>
-              <w:t>פער שדורש חיזוק לפני עלייה לאוויר</w:t>
+              <w:t>כלל שאושר</w:t>
               <w:br/>
             </w:r>
             <w:r>
@@ -3790,7 +3808,7 @@
                 <w:sz w:val="18"/>
                 <w:rtl/>
               </w:rPr>
-              <w:t>בזרימת Open Gym הנוכחית עדיין אין אכיפה מלאה ואחידה של סוג מנוי פתוח, הקפאת מנוי ותשלום משפחתי, כמו באימון קבוצתי. מומלץ לאשר את המפה לעיל ואז להחיל אותה בקוד.</w:t>
+              <w:t>הכניסה ל־Open Gym נאכפת לפי מפת הזכאות: קבוצתי חודשי/שנתי, פתוח חודשי/שנתי או כרטיסייה עם יתרה. נבדקים גם תשלום תקין והקפאת מנוי.</w:t>
             </w:r>
           </w:p>
         </w:tc>
@@ -4914,7 +4932,7 @@
           <w:sz w:val="18"/>
           <w:rtl/>
         </w:rPr>
-        <w:t>כללי Open Gym סופיים: סוגי מנוי מותרים, מכסה חודשית והקפאה.</w:t>
+        <w:t>האם לקבוע מכסת כניסות חודשית ל־Open Gym, מעבר להגבלת התפוסה בכל משבצת.</w:t>
       </w:r>
     </w:p>
     <w:p>
@@ -5444,7 +5462,7 @@
                 <w:sz w:val="18"/>
                 <w:rtl/>
               </w:rPr>
-              <w:t>לאחר אישור סעיף 11, יש לעדכן את כללי Open Gym והצהרת הבריאות, לחבר ספק SMS וספק סליקה, ולהריץ את סעיף 12 כבדיקות קבלה לפני פרסום לציבור.</w:t>
+              <w:t>לאחר אישור יתר ההחלטות בסעיף 11, יש לעדכן את כללי הצהרת הבריאות, לחבר ספק SMS וספק סליקה, ולהריץ את סעיף 12 כבדיקות קבלה לפני פרסום לציבור.</w:t>
             </w:r>
           </w:p>
         </w:tc>

</xml_diff>

<commit_message>
Enforce annual health and approved membership rules
</commit_message>
<xml_diff>
--- a/docs/BALY-wellness-rules-review-he.docx
+++ b/docs/BALY-wellness-rules-review-he.docx
@@ -1136,7 +1136,7 @@
                 <w:sz w:val="16"/>
                 <w:rtl/>
               </w:rPr>
-              <w:t>פרטים אישיים</w:t>
+              <w:t>גיל</w:t>
             </w:r>
           </w:p>
         </w:tc>
@@ -1167,7 +1167,7 @@
                 <w:sz w:val="16"/>
                 <w:rtl/>
               </w:rPr>
-              <w:t>שם מלא, תאריך לידה ומין נדרשים להשלמת ההרשמה.</w:t>
+              <w:t>חשבון עצמאי ניתן לפתוח מגיל 16. צעיר יותר מצורף דרך חשבון משפחתי.</w:t>
             </w:r>
           </w:p>
         </w:tc>
@@ -1231,7 +1231,7 @@
                 <w:sz w:val="16"/>
                 <w:rtl/>
               </w:rPr>
-              <w:t>הצהרת בריאות</w:t>
+              <w:t>פרטים אישיים</w:t>
             </w:r>
           </w:p>
         </w:tc>
@@ -1262,7 +1262,197 @@
                 <w:sz w:val="16"/>
                 <w:rtl/>
               </w:rPr>
-              <w:t>חובה לסמן אישור לפני יצירת החשבון.</w:t>
+              <w:t>שם מלא, תאריך לידה ומין נדרשים להשלמת ההרשמה.</w:t>
+            </w:r>
+          </w:p>
+        </w:tc>
+        <w:tc>
+          <w:tcPr>
+            <w:tcW w:type="dxa" w:w="1417"/>
+            <w:shd w:fill="F8F7F3"/>
+            <w:tcBorders>
+              <w:top w:val="single" w:sz="4" w:color="D8D5CC"/>
+              <w:left w:val="single" w:sz="4" w:color="D8D5CC"/>
+              <w:bottom w:val="single" w:sz="4" w:color="D8D5CC"/>
+              <w:right w:val="single" w:sz="4" w:color="D8D5CC"/>
+              <w:insideH w:val="single" w:sz="4" w:color="D8D5CC"/>
+              <w:insideV w:val="single" w:sz="4" w:color="D8D5CC"/>
+            </w:tcBorders>
+            <w:vAlign w:val="center"/>
+          </w:tcPr>
+          <w:p>
+            <w:pPr>
+              <w:spacing w:after="0"/>
+              <w:jc w:val="right"/>
+              <w:bidi w:val="1"/>
+            </w:pPr>
+            <w:r>
+              <w:rPr>
+                <w:rFonts w:ascii="Arial" w:hAnsi="Arial" w:cs="Arial"/>
+                <w:color w:val="242621"/>
+                <w:sz w:val="16"/>
+                <w:rtl/>
+              </w:rPr>
+              <w:t>קיים</w:t>
+            </w:r>
+          </w:p>
+        </w:tc>
+      </w:tr>
+      <w:tr>
+        <w:tc>
+          <w:tcPr>
+            <w:tcW w:type="dxa" w:w="1871"/>
+            <w:shd w:fill="FFFFFF"/>
+            <w:tcBorders>
+              <w:top w:val="single" w:sz="4" w:color="D8D5CC"/>
+              <w:left w:val="single" w:sz="4" w:color="D8D5CC"/>
+              <w:bottom w:val="single" w:sz="4" w:color="D8D5CC"/>
+              <w:right w:val="single" w:sz="4" w:color="D8D5CC"/>
+              <w:insideH w:val="single" w:sz="4" w:color="D8D5CC"/>
+              <w:insideV w:val="single" w:sz="4" w:color="D8D5CC"/>
+            </w:tcBorders>
+            <w:vAlign w:val="center"/>
+          </w:tcPr>
+          <w:p>
+            <w:pPr>
+              <w:spacing w:after="0"/>
+              <w:jc w:val="right"/>
+              <w:bidi w:val="1"/>
+            </w:pPr>
+            <w:r>
+              <w:rPr>
+                <w:rFonts w:ascii="Arial" w:hAnsi="Arial" w:cs="Arial"/>
+                <w:color w:val="242621"/>
+                <w:sz w:val="16"/>
+                <w:rtl/>
+              </w:rPr>
+              <w:t>הצהרת בריאות</w:t>
+            </w:r>
+          </w:p>
+        </w:tc>
+        <w:tc>
+          <w:tcPr>
+            <w:tcW w:type="dxa" w:w="5896"/>
+            <w:shd w:fill="FFFFFF"/>
+            <w:tcBorders>
+              <w:top w:val="single" w:sz="4" w:color="D8D5CC"/>
+              <w:left w:val="single" w:sz="4" w:color="D8D5CC"/>
+              <w:bottom w:val="single" w:sz="4" w:color="D8D5CC"/>
+              <w:right w:val="single" w:sz="4" w:color="D8D5CC"/>
+              <w:insideH w:val="single" w:sz="4" w:color="D8D5CC"/>
+              <w:insideV w:val="single" w:sz="4" w:color="D8D5CC"/>
+            </w:tcBorders>
+            <w:vAlign w:val="center"/>
+          </w:tcPr>
+          <w:p>
+            <w:pPr>
+              <w:spacing w:after="0"/>
+              <w:jc w:val="right"/>
+              <w:bidi w:val="1"/>
+            </w:pPr>
+            <w:r>
+              <w:rPr>
+                <w:rFonts w:ascii="Arial" w:hAnsi="Arial" w:cs="Arial"/>
+                <w:color w:val="242621"/>
+                <w:sz w:val="16"/>
+                <w:rtl/>
+              </w:rPr>
+              <w:t>חתימה חובה; תוקף לשנה. לאחר שנה נדרשת חתימה מחדש.</w:t>
+            </w:r>
+          </w:p>
+        </w:tc>
+        <w:tc>
+          <w:tcPr>
+            <w:tcW w:type="dxa" w:w="1417"/>
+            <w:shd w:fill="FFFFFF"/>
+            <w:tcBorders>
+              <w:top w:val="single" w:sz="4" w:color="D8D5CC"/>
+              <w:left w:val="single" w:sz="4" w:color="D8D5CC"/>
+              <w:bottom w:val="single" w:sz="4" w:color="D8D5CC"/>
+              <w:right w:val="single" w:sz="4" w:color="D8D5CC"/>
+              <w:insideH w:val="single" w:sz="4" w:color="D8D5CC"/>
+              <w:insideV w:val="single" w:sz="4" w:color="D8D5CC"/>
+            </w:tcBorders>
+            <w:vAlign w:val="center"/>
+          </w:tcPr>
+          <w:p>
+            <w:pPr>
+              <w:spacing w:after="0"/>
+              <w:jc w:val="right"/>
+              <w:bidi w:val="1"/>
+            </w:pPr>
+            <w:r>
+              <w:rPr>
+                <w:rFonts w:ascii="Arial" w:hAnsi="Arial" w:cs="Arial"/>
+                <w:color w:val="242621"/>
+                <w:sz w:val="16"/>
+                <w:rtl/>
+              </w:rPr>
+              <w:t>קיים</w:t>
+            </w:r>
+          </w:p>
+        </w:tc>
+      </w:tr>
+      <w:tr>
+        <w:tc>
+          <w:tcPr>
+            <w:tcW w:type="dxa" w:w="1871"/>
+            <w:shd w:fill="F8F7F3"/>
+            <w:tcBorders>
+              <w:top w:val="single" w:sz="4" w:color="D8D5CC"/>
+              <w:left w:val="single" w:sz="4" w:color="D8D5CC"/>
+              <w:bottom w:val="single" w:sz="4" w:color="D8D5CC"/>
+              <w:right w:val="single" w:sz="4" w:color="D8D5CC"/>
+              <w:insideH w:val="single" w:sz="4" w:color="D8D5CC"/>
+              <w:insideV w:val="single" w:sz="4" w:color="D8D5CC"/>
+            </w:tcBorders>
+            <w:vAlign w:val="center"/>
+          </w:tcPr>
+          <w:p>
+            <w:pPr>
+              <w:spacing w:after="0"/>
+              <w:jc w:val="right"/>
+              <w:bidi w:val="1"/>
+            </w:pPr>
+            <w:r>
+              <w:rPr>
+                <w:rFonts w:ascii="Arial" w:hAnsi="Arial" w:cs="Arial"/>
+                <w:color w:val="242621"/>
+                <w:sz w:val="16"/>
+                <w:rtl/>
+              </w:rPr>
+              <w:t>הסכם הצטרפות</w:t>
+            </w:r>
+          </w:p>
+        </w:tc>
+        <w:tc>
+          <w:tcPr>
+            <w:tcW w:type="dxa" w:w="5896"/>
+            <w:shd w:fill="F8F7F3"/>
+            <w:tcBorders>
+              <w:top w:val="single" w:sz="4" w:color="D8D5CC"/>
+              <w:left w:val="single" w:sz="4" w:color="D8D5CC"/>
+              <w:bottom w:val="single" w:sz="4" w:color="D8D5CC"/>
+              <w:right w:val="single" w:sz="4" w:color="D8D5CC"/>
+              <w:insideH w:val="single" w:sz="4" w:color="D8D5CC"/>
+              <w:insideV w:val="single" w:sz="4" w:color="D8D5CC"/>
+            </w:tcBorders>
+            <w:vAlign w:val="center"/>
+          </w:tcPr>
+          <w:p>
+            <w:pPr>
+              <w:spacing w:after="0"/>
+              <w:jc w:val="right"/>
+              <w:bidi w:val="1"/>
+            </w:pPr>
+            <w:r>
+              <w:rPr>
+                <w:rFonts w:ascii="Arial" w:hAnsi="Arial" w:cs="Arial"/>
+                <w:color w:val="242621"/>
+                <w:sz w:val="16"/>
+                <w:rtl/>
+              </w:rPr>
+              <w:t>חתימה חובה על ההסכם, התקנון, מדיניות הביטולים והפרטיות.</w:t>
             </w:r>
           </w:p>
         </w:tc>
@@ -1675,7 +1865,7 @@
                 <w:sz w:val="16"/>
                 <w:rtl/>
               </w:rPr>
-              <w:t>תשלום</w:t>
+              <w:t>הצהרת בריאות</w:t>
             </w:r>
           </w:p>
         </w:tc>
@@ -1706,7 +1896,135 @@
                 <w:sz w:val="16"/>
                 <w:rtl/>
               </w:rPr>
+              <w:t>חתומה ובתוקף. הצהרה חסרה או שחלפה שנה מחתימתה חוסמת את כל האימונים.</w:t>
+            </w:r>
+          </w:p>
+        </w:tc>
+      </w:tr>
+      <w:tr>
+        <w:tc>
+          <w:tcPr>
+            <w:tcW w:type="dxa" w:w="2268"/>
+            <w:shd w:fill="FFFFFF"/>
+            <w:tcBorders>
+              <w:top w:val="single" w:sz="4" w:color="D8D5CC"/>
+              <w:left w:val="single" w:sz="4" w:color="D8D5CC"/>
+              <w:bottom w:val="single" w:sz="4" w:color="D8D5CC"/>
+              <w:right w:val="single" w:sz="4" w:color="D8D5CC"/>
+              <w:insideH w:val="single" w:sz="4" w:color="D8D5CC"/>
+              <w:insideV w:val="single" w:sz="4" w:color="D8D5CC"/>
+            </w:tcBorders>
+            <w:vAlign w:val="center"/>
+          </w:tcPr>
+          <w:p>
+            <w:pPr>
+              <w:spacing w:after="0"/>
+              <w:jc w:val="right"/>
+              <w:bidi w:val="1"/>
+            </w:pPr>
+            <w:r>
+              <w:rPr>
+                <w:rFonts w:ascii="Arial" w:hAnsi="Arial" w:cs="Arial"/>
+                <w:color w:val="242621"/>
+                <w:sz w:val="16"/>
+                <w:rtl/>
+              </w:rPr>
+              <w:t>תשלום</w:t>
+            </w:r>
+          </w:p>
+        </w:tc>
+        <w:tc>
+          <w:tcPr>
+            <w:tcW w:type="dxa" w:w="6917"/>
+            <w:shd w:fill="FFFFFF"/>
+            <w:tcBorders>
+              <w:top w:val="single" w:sz="4" w:color="D8D5CC"/>
+              <w:left w:val="single" w:sz="4" w:color="D8D5CC"/>
+              <w:bottom w:val="single" w:sz="4" w:color="D8D5CC"/>
+              <w:right w:val="single" w:sz="4" w:color="D8D5CC"/>
+              <w:insideH w:val="single" w:sz="4" w:color="D8D5CC"/>
+              <w:insideV w:val="single" w:sz="4" w:color="D8D5CC"/>
+            </w:tcBorders>
+            <w:vAlign w:val="center"/>
+          </w:tcPr>
+          <w:p>
+            <w:pPr>
+              <w:spacing w:after="0"/>
+              <w:jc w:val="right"/>
+              <w:bidi w:val="1"/>
+            </w:pPr>
+            <w:r>
+              <w:rPr>
+                <w:rFonts w:ascii="Arial" w:hAnsi="Arial" w:cs="Arial"/>
+                <w:color w:val="242621"/>
+                <w:sz w:val="16"/>
+                <w:rtl/>
+              </w:rPr>
               <w:t>מנוי פעיל; או אישור תשלום אופליין ממנהל; או מנוי משפחתי ששולם בידי המשלם הראשי.</w:t>
+            </w:r>
+          </w:p>
+        </w:tc>
+      </w:tr>
+      <w:tr>
+        <w:tc>
+          <w:tcPr>
+            <w:tcW w:type="dxa" w:w="2268"/>
+            <w:shd w:fill="F8F7F3"/>
+            <w:tcBorders>
+              <w:top w:val="single" w:sz="4" w:color="D8D5CC"/>
+              <w:left w:val="single" w:sz="4" w:color="D8D5CC"/>
+              <w:bottom w:val="single" w:sz="4" w:color="D8D5CC"/>
+              <w:right w:val="single" w:sz="4" w:color="D8D5CC"/>
+              <w:insideH w:val="single" w:sz="4" w:color="D8D5CC"/>
+              <w:insideV w:val="single" w:sz="4" w:color="D8D5CC"/>
+            </w:tcBorders>
+            <w:vAlign w:val="center"/>
+          </w:tcPr>
+          <w:p>
+            <w:pPr>
+              <w:spacing w:after="0"/>
+              <w:jc w:val="right"/>
+              <w:bidi w:val="1"/>
+            </w:pPr>
+            <w:r>
+              <w:rPr>
+                <w:rFonts w:ascii="Arial" w:hAnsi="Arial" w:cs="Arial"/>
+                <w:color w:val="242621"/>
+                <w:sz w:val="16"/>
+                <w:rtl/>
+              </w:rPr>
+              <w:t>תוקף מנוי</w:t>
+            </w:r>
+          </w:p>
+        </w:tc>
+        <w:tc>
+          <w:tcPr>
+            <w:tcW w:type="dxa" w:w="6917"/>
+            <w:shd w:fill="F8F7F3"/>
+            <w:tcBorders>
+              <w:top w:val="single" w:sz="4" w:color="D8D5CC"/>
+              <w:left w:val="single" w:sz="4" w:color="D8D5CC"/>
+              <w:bottom w:val="single" w:sz="4" w:color="D8D5CC"/>
+              <w:right w:val="single" w:sz="4" w:color="D8D5CC"/>
+              <w:insideH w:val="single" w:sz="4" w:color="D8D5CC"/>
+              <w:insideV w:val="single" w:sz="4" w:color="D8D5CC"/>
+            </w:tcBorders>
+            <w:vAlign w:val="center"/>
+          </w:tcPr>
+          <w:p>
+            <w:pPr>
+              <w:spacing w:after="0"/>
+              <w:jc w:val="right"/>
+              <w:bidi w:val="1"/>
+            </w:pPr>
+            <w:r>
+              <w:rPr>
+                <w:rFonts w:ascii="Arial" w:hAnsi="Arial" w:cs="Arial"/>
+                <w:color w:val="242621"/>
+                <w:sz w:val="16"/>
+                <w:rtl/>
+              </w:rPr>
+              <w:t>תאריך התפוגה נבדק בכל הרשמה; מנוי שפג חוסם הרשמה גם אם נשמר סטטוס ACTIVE.</w:t>
             </w:r>
           </w:p>
         </w:tc>
@@ -1931,6 +2249,70 @@
                 <w:sz w:val="16"/>
                 <w:rtl/>
               </w:rPr>
+              <w:t>חפיפת שעות</w:t>
+            </w:r>
+          </w:p>
+        </w:tc>
+        <w:tc>
+          <w:tcPr>
+            <w:tcW w:type="dxa" w:w="6917"/>
+            <w:shd w:fill="F8F7F3"/>
+            <w:tcBorders>
+              <w:top w:val="single" w:sz="4" w:color="D8D5CC"/>
+              <w:left w:val="single" w:sz="4" w:color="D8D5CC"/>
+              <w:bottom w:val="single" w:sz="4" w:color="D8D5CC"/>
+              <w:right w:val="single" w:sz="4" w:color="D8D5CC"/>
+              <w:insideH w:val="single" w:sz="4" w:color="D8D5CC"/>
+              <w:insideV w:val="single" w:sz="4" w:color="D8D5CC"/>
+            </w:tcBorders>
+            <w:vAlign w:val="center"/>
+          </w:tcPr>
+          <w:p>
+            <w:pPr>
+              <w:spacing w:after="0"/>
+              <w:jc w:val="right"/>
+              <w:bidi w:val="1"/>
+            </w:pPr>
+            <w:r>
+              <w:rPr>
+                <w:rFonts w:ascii="Arial" w:hAnsi="Arial" w:cs="Arial"/>
+                <w:color w:val="242621"/>
+                <w:sz w:val="16"/>
+                <w:rtl/>
+              </w:rPr>
+              <w:t>לא ניתן להירשם לשני אימונים או למשבצת Open Gym חופפת.</w:t>
+            </w:r>
+          </w:p>
+        </w:tc>
+      </w:tr>
+      <w:tr>
+        <w:tc>
+          <w:tcPr>
+            <w:tcW w:type="dxa" w:w="2268"/>
+            <w:shd w:fill="FFFFFF"/>
+            <w:tcBorders>
+              <w:top w:val="single" w:sz="4" w:color="D8D5CC"/>
+              <w:left w:val="single" w:sz="4" w:color="D8D5CC"/>
+              <w:bottom w:val="single" w:sz="4" w:color="D8D5CC"/>
+              <w:right w:val="single" w:sz="4" w:color="D8D5CC"/>
+              <w:insideH w:val="single" w:sz="4" w:color="D8D5CC"/>
+              <w:insideV w:val="single" w:sz="4" w:color="D8D5CC"/>
+            </w:tcBorders>
+            <w:vAlign w:val="center"/>
+          </w:tcPr>
+          <w:p>
+            <w:pPr>
+              <w:spacing w:after="0"/>
+              <w:jc w:val="right"/>
+              <w:bidi w:val="1"/>
+            </w:pPr>
+            <w:r>
+              <w:rPr>
+                <w:rFonts w:ascii="Arial" w:hAnsi="Arial" w:cs="Arial"/>
+                <w:color w:val="242621"/>
+                <w:sz w:val="16"/>
+                <w:rtl/>
+              </w:rPr>
               <w:t>מקום פנוי</w:t>
             </w:r>
           </w:p>
@@ -1938,7 +2320,7 @@
         <w:tc>
           <w:tcPr>
             <w:tcW w:type="dxa" w:w="6917"/>
-            <w:shd w:fill="F8F7F3"/>
+            <w:shd w:fill="FFFFFF"/>
             <w:tcBorders>
               <w:top w:val="single" w:sz="4" w:color="D8D5CC"/>
               <w:left w:val="single" w:sz="4" w:color="D8D5CC"/>
@@ -1987,14 +2369,14 @@
         <w:tc>
           <w:tcPr>
             <w:tcW w:type="dxa" w:w="10080"/>
-            <w:shd w:fill="FBE9E9"/>
+            <w:shd w:fill="E5F3EC"/>
             <w:tcBorders>
-              <w:top w:val="single" w:sz="7" w:color="D99696"/>
-              <w:left w:val="single" w:sz="7" w:color="D99696"/>
-              <w:bottom w:val="single" w:sz="7" w:color="D99696"/>
-              <w:right w:val="single" w:sz="7" w:color="D99696"/>
-              <w:insideH w:val="single" w:sz="7" w:color="D99696"/>
-              <w:insideV w:val="single" w:sz="7" w:color="D99696"/>
+              <w:top w:val="single" w:sz="7" w:color="6EAA8F"/>
+              <w:left w:val="single" w:sz="7" w:color="6EAA8F"/>
+              <w:bottom w:val="single" w:sz="7" w:color="6EAA8F"/>
+              <w:right w:val="single" w:sz="7" w:color="6EAA8F"/>
+              <w:insideH w:val="single" w:sz="7" w:color="6EAA8F"/>
+              <w:insideV w:val="single" w:sz="7" w:color="6EAA8F"/>
             </w:tcBorders>
             <w:vAlign w:val="center"/>
           </w:tcPr>
@@ -2012,7 +2394,7 @@
                 <w:sz w:val="20"/>
                 <w:rtl/>
               </w:rPr>
-              <w:t>נקודה לבדיקה שלך</w:t>
+              <w:t>כלל בריאות שאושר</w:t>
               <w:br/>
             </w:r>
             <w:r>
@@ -2022,7 +2404,7 @@
                 <w:sz w:val="18"/>
                 <w:rtl/>
               </w:rPr>
-              <w:t>הצהרת בריאות נדרשת בעת יצירת חשבון, אך כרגע אינה נבדקת מחדש בכל לחיצה על הרשמה. יש להחליט האם הצהרה שפג תוקפה או חסרה צריכה לחסום אימונים.</w:t>
+              <w:t>הצהרת בריאות לא חתומה או הצהרה שחלפה שנה ממועד חתימתה חוסמת הרשמה לאימון קבוצתי, אישי ו־Open Gym. ניתן לחתום מחדש מתוך הפרופיל.</w:t>
             </w:r>
           </w:p>
         </w:tc>
@@ -3858,7 +4240,7 @@
           <w:sz w:val="18"/>
           <w:rtl/>
         </w:rPr>
-        <w:t>כל משתמש ברשימת המתנה מקבל דירוג עדיפות מתוך פרופיל המשתמש.</w:t>
+        <w:t>סדר ההמתנה נקבע לפי זמן ההצטרפות בלבד — כל הקודם זוכה.</w:t>
       </w:r>
     </w:p>
     <w:p>
@@ -3894,7 +4276,7 @@
           <w:sz w:val="18"/>
           <w:rtl/>
         </w:rPr>
-        <w:t>לאחר הגעה לסף נקודות שחורות (ברירת מחדל: 3), דירוג העדיפות יורד מ־100 ל־50.</w:t>
+        <w:t>נקודות שחורות אינן משנות את מיקום המשתמש ברשימת ההמתנה.</w:t>
       </w:r>
     </w:p>
     <w:p>
@@ -3912,7 +4294,7 @@
           <w:sz w:val="18"/>
           <w:rtl/>
         </w:rPr>
-        <w:t>נקודות שחורות פגות אוטומטית לאחר חודש, ואז הדירוג מחושב מחדש.</w:t>
+        <w:t>בקידום מהמתנה תישלח הודעת PUSH למשתמש כאשר PUSH פעיל במכשיר.</w:t>
       </w:r>
     </w:p>
     <w:tbl>
@@ -3929,7 +4311,7 @@
         <w:tc>
           <w:tcPr>
             <w:tcW w:type="dxa" w:w="10080"/>
-            <w:shd w:fill="FFF3D6"/>
+            <w:shd w:fill="F3F0E8"/>
             <w:tcBorders>
               <w:top w:val="single" w:sz="7" w:color="C9A867"/>
               <w:left w:val="single" w:sz="7" w:color="C9A867"/>
@@ -3954,7 +4336,7 @@
                 <w:sz w:val="20"/>
                 <w:rtl/>
               </w:rPr>
-              <w:t>החלטה עסקית נדרשת</w:t>
+              <w:t>התראות PUSH</w:t>
               <w:br/>
             </w:r>
             <w:r>
@@ -3964,7 +4346,7 @@
                 <w:sz w:val="18"/>
                 <w:rtl/>
               </w:rPr>
-              <w:t>יש לאשר אם סדר ההמתנה צריך להיקבע רק לפי דירוג, או לפי שילוב של דירוג + זמן הצטרפות; וכן כיצד מודיעים למשתמש שקודם.</w:t>
+              <w:t>המשתמש יכול להפעיל או לבטל PUSH ותזכורות אימון. מנהל יכול להפעיל PUSH עבור פניות שמופנות אליו. שליחה כשהיישום סגור דורשת ספק Push ו־Service Worker ב־Production.</w:t>
             </w:r>
           </w:p>
         </w:tc>
@@ -4348,7 +4730,7 @@
                 <w:sz w:val="16"/>
                 <w:rtl/>
               </w:rPr>
-              <w:t>פחות מ־12 שעות לפני האימון.</w:t>
+              <w:t>בתוך חלון הביטול האחיד של 2 שעות.</w:t>
             </w:r>
           </w:p>
         </w:tc>
@@ -4581,6 +4963,11 @@
       </w:pPr>
     </w:p>
     <w:p>
+      <w:r>
+        <w:br w:type="page"/>
+      </w:r>
+    </w:p>
+    <w:p>
       <w:pPr>
         <w:pStyle w:val="Heading1"/>
         <w:spacing w:before="240" w:after="100"/>
@@ -4693,6 +5080,662 @@
       <w:tblPr>
         <w:tblW w:type="auto" w:w="0"/>
         <w:jc w:val="center"/>
+        <w:tblLayout w:type="fixed"/>
+        <w:tblLook w:firstColumn="1" w:firstRow="1" w:lastColumn="0" w:lastRow="0" w:noHBand="0" w:noVBand="1" w:val="04A0"/>
+        <w:bidiVisual w:val="1"/>
+      </w:tblPr>
+      <w:tblGrid>
+        <w:gridCol w:w="5040"/>
+        <w:gridCol w:w="5040"/>
+      </w:tblGrid>
+      <w:tr>
+        <w:tc>
+          <w:tcPr>
+            <w:tcW w:type="dxa" w:w="1984"/>
+            <w:shd w:fill="1D1F1B"/>
+            <w:tcBorders>
+              <w:top w:val="single" w:sz="4" w:color="343730"/>
+              <w:left w:val="single" w:sz="4" w:color="343730"/>
+              <w:bottom w:val="single" w:sz="4" w:color="343730"/>
+              <w:right w:val="single" w:sz="4" w:color="343730"/>
+              <w:insideH w:val="single" w:sz="4" w:color="343730"/>
+              <w:insideV w:val="single" w:sz="4" w:color="343730"/>
+            </w:tcBorders>
+          </w:tcPr>
+          <w:p>
+            <w:pPr>
+              <w:jc w:val="right"/>
+              <w:bidi w:val="1"/>
+            </w:pPr>
+            <w:r>
+              <w:rPr>
+                <w:rFonts w:ascii="Arial" w:hAnsi="Arial" w:cs="Arial"/>
+                <w:b/>
+                <w:color w:val="FFFFFF"/>
+                <w:sz w:val="17"/>
+                <w:rtl/>
+              </w:rPr>
+              <w:t>נושא</w:t>
+            </w:r>
+          </w:p>
+        </w:tc>
+        <w:tc>
+          <w:tcPr>
+            <w:tcW w:type="dxa" w:w="7200"/>
+            <w:shd w:fill="1D1F1B"/>
+            <w:tcBorders>
+              <w:top w:val="single" w:sz="4" w:color="343730"/>
+              <w:left w:val="single" w:sz="4" w:color="343730"/>
+              <w:bottom w:val="single" w:sz="4" w:color="343730"/>
+              <w:right w:val="single" w:sz="4" w:color="343730"/>
+              <w:insideH w:val="single" w:sz="4" w:color="343730"/>
+              <w:insideV w:val="single" w:sz="4" w:color="343730"/>
+            </w:tcBorders>
+          </w:tcPr>
+          <w:p>
+            <w:pPr>
+              <w:jc w:val="right"/>
+              <w:bidi w:val="1"/>
+            </w:pPr>
+            <w:r>
+              <w:rPr>
+                <w:rFonts w:ascii="Arial" w:hAnsi="Arial" w:cs="Arial"/>
+                <w:b/>
+                <w:color w:val="FFFFFF"/>
+                <w:sz w:val="17"/>
+                <w:rtl/>
+              </w:rPr>
+              <w:t>כלל מערכת שנדרש לסליקה</w:t>
+            </w:r>
+          </w:p>
+        </w:tc>
+      </w:tr>
+      <w:tr>
+        <w:tc>
+          <w:tcPr>
+            <w:tcW w:type="dxa" w:w="1984"/>
+            <w:shd w:fill="FFFFFF"/>
+            <w:tcBorders>
+              <w:top w:val="single" w:sz="4" w:color="D8D5CC"/>
+              <w:left w:val="single" w:sz="4" w:color="D8D5CC"/>
+              <w:bottom w:val="single" w:sz="4" w:color="D8D5CC"/>
+              <w:right w:val="single" w:sz="4" w:color="D8D5CC"/>
+              <w:insideH w:val="single" w:sz="4" w:color="D8D5CC"/>
+              <w:insideV w:val="single" w:sz="4" w:color="D8D5CC"/>
+            </w:tcBorders>
+            <w:vAlign w:val="center"/>
+          </w:tcPr>
+          <w:p>
+            <w:pPr>
+              <w:spacing w:after="0"/>
+              <w:jc w:val="right"/>
+              <w:bidi w:val="1"/>
+            </w:pPr>
+            <w:r>
+              <w:rPr>
+                <w:rFonts w:ascii="Arial" w:hAnsi="Arial" w:cs="Arial"/>
+                <w:color w:val="242621"/>
+                <w:sz w:val="16"/>
+                <w:rtl/>
+              </w:rPr>
+              <w:t>מחירים ומע״מ</w:t>
+            </w:r>
+          </w:p>
+        </w:tc>
+        <w:tc>
+          <w:tcPr>
+            <w:tcW w:type="dxa" w:w="7200"/>
+            <w:shd w:fill="FFFFFF"/>
+            <w:tcBorders>
+              <w:top w:val="single" w:sz="4" w:color="D8D5CC"/>
+              <w:left w:val="single" w:sz="4" w:color="D8D5CC"/>
+              <w:bottom w:val="single" w:sz="4" w:color="D8D5CC"/>
+              <w:right w:val="single" w:sz="4" w:color="D8D5CC"/>
+              <w:insideH w:val="single" w:sz="4" w:color="D8D5CC"/>
+              <w:insideV w:val="single" w:sz="4" w:color="D8D5CC"/>
+            </w:tcBorders>
+            <w:vAlign w:val="center"/>
+          </w:tcPr>
+          <w:p>
+            <w:pPr>
+              <w:spacing w:after="0"/>
+              <w:jc w:val="right"/>
+              <w:bidi w:val="1"/>
+            </w:pPr>
+            <w:r>
+              <w:rPr>
+                <w:rFonts w:ascii="Arial" w:hAnsi="Arial" w:cs="Arial"/>
+                <w:color w:val="242621"/>
+                <w:sz w:val="16"/>
+                <w:rtl/>
+              </w:rPr>
+              <w:t>מחירי המסלולים מוצגים לפני אישור; המחיר לצרכן כולל מע״מ ומצוין גם בקבלה.</w:t>
+            </w:r>
+          </w:p>
+        </w:tc>
+      </w:tr>
+      <w:tr>
+        <w:tc>
+          <w:tcPr>
+            <w:tcW w:type="dxa" w:w="1984"/>
+            <w:shd w:fill="F8F7F3"/>
+            <w:tcBorders>
+              <w:top w:val="single" w:sz="4" w:color="D8D5CC"/>
+              <w:left w:val="single" w:sz="4" w:color="D8D5CC"/>
+              <w:bottom w:val="single" w:sz="4" w:color="D8D5CC"/>
+              <w:right w:val="single" w:sz="4" w:color="D8D5CC"/>
+              <w:insideH w:val="single" w:sz="4" w:color="D8D5CC"/>
+              <w:insideV w:val="single" w:sz="4" w:color="D8D5CC"/>
+            </w:tcBorders>
+            <w:vAlign w:val="center"/>
+          </w:tcPr>
+          <w:p>
+            <w:pPr>
+              <w:spacing w:after="0"/>
+              <w:jc w:val="right"/>
+              <w:bidi w:val="1"/>
+            </w:pPr>
+            <w:r>
+              <w:rPr>
+                <w:rFonts w:ascii="Arial" w:hAnsi="Arial" w:cs="Arial"/>
+                <w:color w:val="242621"/>
+                <w:sz w:val="16"/>
+                <w:rtl/>
+              </w:rPr>
+              <w:t>חיוב מחזורי</w:t>
+            </w:r>
+          </w:p>
+        </w:tc>
+        <w:tc>
+          <w:tcPr>
+            <w:tcW w:type="dxa" w:w="7200"/>
+            <w:shd w:fill="F8F7F3"/>
+            <w:tcBorders>
+              <w:top w:val="single" w:sz="4" w:color="D8D5CC"/>
+              <w:left w:val="single" w:sz="4" w:color="D8D5CC"/>
+              <w:bottom w:val="single" w:sz="4" w:color="D8D5CC"/>
+              <w:right w:val="single" w:sz="4" w:color="D8D5CC"/>
+              <w:insideH w:val="single" w:sz="4" w:color="D8D5CC"/>
+              <w:insideV w:val="single" w:sz="4" w:color="D8D5CC"/>
+            </w:tcBorders>
+            <w:vAlign w:val="center"/>
+          </w:tcPr>
+          <w:p>
+            <w:pPr>
+              <w:spacing w:after="0"/>
+              <w:jc w:val="right"/>
+              <w:bidi w:val="1"/>
+            </w:pPr>
+            <w:r>
+              <w:rPr>
+                <w:rFonts w:ascii="Arial" w:hAnsi="Arial" w:cs="Arial"/>
+                <w:color w:val="242621"/>
+                <w:sz w:val="16"/>
+                <w:rtl/>
+              </w:rPr>
+              <w:t>מנוי חודשי מתחדש מדי חודש. מנוי שנתי הוא התחייבות ל־12 חודשים עם חיוב חודשי.</w:t>
+            </w:r>
+          </w:p>
+        </w:tc>
+      </w:tr>
+      <w:tr>
+        <w:tc>
+          <w:tcPr>
+            <w:tcW w:type="dxa" w:w="1984"/>
+            <w:shd w:fill="FFFFFF"/>
+            <w:tcBorders>
+              <w:top w:val="single" w:sz="4" w:color="D8D5CC"/>
+              <w:left w:val="single" w:sz="4" w:color="D8D5CC"/>
+              <w:bottom w:val="single" w:sz="4" w:color="D8D5CC"/>
+              <w:right w:val="single" w:sz="4" w:color="D8D5CC"/>
+              <w:insideH w:val="single" w:sz="4" w:color="D8D5CC"/>
+              <w:insideV w:val="single" w:sz="4" w:color="D8D5CC"/>
+            </w:tcBorders>
+            <w:vAlign w:val="center"/>
+          </w:tcPr>
+          <w:p>
+            <w:pPr>
+              <w:spacing w:after="0"/>
+              <w:jc w:val="right"/>
+              <w:bidi w:val="1"/>
+            </w:pPr>
+            <w:r>
+              <w:rPr>
+                <w:rFonts w:ascii="Arial" w:hAnsi="Arial" w:cs="Arial"/>
+                <w:color w:val="242621"/>
+                <w:sz w:val="16"/>
+                <w:rtl/>
+              </w:rPr>
+              <w:t>אישור תשלום</w:t>
+            </w:r>
+          </w:p>
+        </w:tc>
+        <w:tc>
+          <w:tcPr>
+            <w:tcW w:type="dxa" w:w="7200"/>
+            <w:shd w:fill="FFFFFF"/>
+            <w:tcBorders>
+              <w:top w:val="single" w:sz="4" w:color="D8D5CC"/>
+              <w:left w:val="single" w:sz="4" w:color="D8D5CC"/>
+              <w:bottom w:val="single" w:sz="4" w:color="D8D5CC"/>
+              <w:right w:val="single" w:sz="4" w:color="D8D5CC"/>
+              <w:insideH w:val="single" w:sz="4" w:color="D8D5CC"/>
+              <w:insideV w:val="single" w:sz="4" w:color="D8D5CC"/>
+            </w:tcBorders>
+            <w:vAlign w:val="center"/>
+          </w:tcPr>
+          <w:p>
+            <w:pPr>
+              <w:spacing w:after="0"/>
+              <w:jc w:val="right"/>
+              <w:bidi w:val="1"/>
+            </w:pPr>
+            <w:r>
+              <w:rPr>
+                <w:rFonts w:ascii="Arial" w:hAnsi="Arial" w:cs="Arial"/>
+                <w:color w:val="242621"/>
+                <w:sz w:val="16"/>
+                <w:rtl/>
+              </w:rPr>
+              <w:t>הפעלה רק לאחר אישור ספק הסליקה; נשמרים סכום, מסלול, מועד ואסמכתה.</w:t>
+            </w:r>
+          </w:p>
+        </w:tc>
+      </w:tr>
+      <w:tr>
+        <w:tc>
+          <w:tcPr>
+            <w:tcW w:type="dxa" w:w="1984"/>
+            <w:shd w:fill="F8F7F3"/>
+            <w:tcBorders>
+              <w:top w:val="single" w:sz="4" w:color="D8D5CC"/>
+              <w:left w:val="single" w:sz="4" w:color="D8D5CC"/>
+              <w:bottom w:val="single" w:sz="4" w:color="D8D5CC"/>
+              <w:right w:val="single" w:sz="4" w:color="D8D5CC"/>
+              <w:insideH w:val="single" w:sz="4" w:color="D8D5CC"/>
+              <w:insideV w:val="single" w:sz="4" w:color="D8D5CC"/>
+            </w:tcBorders>
+            <w:vAlign w:val="center"/>
+          </w:tcPr>
+          <w:p>
+            <w:pPr>
+              <w:spacing w:after="0"/>
+              <w:jc w:val="right"/>
+              <w:bidi w:val="1"/>
+            </w:pPr>
+            <w:r>
+              <w:rPr>
+                <w:rFonts w:ascii="Arial" w:hAnsi="Arial" w:cs="Arial"/>
+                <w:color w:val="242621"/>
+                <w:sz w:val="16"/>
+                <w:rtl/>
+              </w:rPr>
+              <w:t>קבלה</w:t>
+            </w:r>
+          </w:p>
+        </w:tc>
+        <w:tc>
+          <w:tcPr>
+            <w:tcW w:type="dxa" w:w="7200"/>
+            <w:shd w:fill="F8F7F3"/>
+            <w:tcBorders>
+              <w:top w:val="single" w:sz="4" w:color="D8D5CC"/>
+              <w:left w:val="single" w:sz="4" w:color="D8D5CC"/>
+              <w:bottom w:val="single" w:sz="4" w:color="D8D5CC"/>
+              <w:right w:val="single" w:sz="4" w:color="D8D5CC"/>
+              <w:insideH w:val="single" w:sz="4" w:color="D8D5CC"/>
+              <w:insideV w:val="single" w:sz="4" w:color="D8D5CC"/>
+            </w:tcBorders>
+            <w:vAlign w:val="center"/>
+          </w:tcPr>
+          <w:p>
+            <w:pPr>
+              <w:spacing w:after="0"/>
+              <w:jc w:val="right"/>
+              <w:bidi w:val="1"/>
+            </w:pPr>
+            <w:r>
+              <w:rPr>
+                <w:rFonts w:ascii="Arial" w:hAnsi="Arial" w:cs="Arial"/>
+                <w:color w:val="242621"/>
+                <w:sz w:val="16"/>
+                <w:rtl/>
+              </w:rPr>
+              <w:t>קבלה דיגיטלית נשלחת למשתמש ונשמרת בהיסטוריית התשלומים.</w:t>
+            </w:r>
+          </w:p>
+        </w:tc>
+      </w:tr>
+      <w:tr>
+        <w:tc>
+          <w:tcPr>
+            <w:tcW w:type="dxa" w:w="1984"/>
+            <w:shd w:fill="FFFFFF"/>
+            <w:tcBorders>
+              <w:top w:val="single" w:sz="4" w:color="D8D5CC"/>
+              <w:left w:val="single" w:sz="4" w:color="D8D5CC"/>
+              <w:bottom w:val="single" w:sz="4" w:color="D8D5CC"/>
+              <w:right w:val="single" w:sz="4" w:color="D8D5CC"/>
+              <w:insideH w:val="single" w:sz="4" w:color="D8D5CC"/>
+              <w:insideV w:val="single" w:sz="4" w:color="D8D5CC"/>
+            </w:tcBorders>
+            <w:vAlign w:val="center"/>
+          </w:tcPr>
+          <w:p>
+            <w:pPr>
+              <w:spacing w:after="0"/>
+              <w:jc w:val="right"/>
+              <w:bidi w:val="1"/>
+            </w:pPr>
+            <w:r>
+              <w:rPr>
+                <w:rFonts w:ascii="Arial" w:hAnsi="Arial" w:cs="Arial"/>
+                <w:color w:val="242621"/>
+                <w:sz w:val="16"/>
+                <w:rtl/>
+              </w:rPr>
+              <w:t>כשל חיוב</w:t>
+            </w:r>
+          </w:p>
+        </w:tc>
+        <w:tc>
+          <w:tcPr>
+            <w:tcW w:type="dxa" w:w="7200"/>
+            <w:shd w:fill="FFFFFF"/>
+            <w:tcBorders>
+              <w:top w:val="single" w:sz="4" w:color="D8D5CC"/>
+              <w:left w:val="single" w:sz="4" w:color="D8D5CC"/>
+              <w:bottom w:val="single" w:sz="4" w:color="D8D5CC"/>
+              <w:right w:val="single" w:sz="4" w:color="D8D5CC"/>
+              <w:insideH w:val="single" w:sz="4" w:color="D8D5CC"/>
+              <w:insideV w:val="single" w:sz="4" w:color="D8D5CC"/>
+            </w:tcBorders>
+            <w:vAlign w:val="center"/>
+          </w:tcPr>
+          <w:p>
+            <w:pPr>
+              <w:spacing w:after="0"/>
+              <w:jc w:val="right"/>
+              <w:bidi w:val="1"/>
+            </w:pPr>
+            <w:r>
+              <w:rPr>
+                <w:rFonts w:ascii="Arial" w:hAnsi="Arial" w:cs="Arial"/>
+                <w:color w:val="242621"/>
+                <w:sz w:val="16"/>
+                <w:rtl/>
+              </w:rPr>
+              <w:t>המנוי עובר לסטטוס חוב, הרשמה נחסמת ונשלחת התראת PUSH עם אפשרות לתשלום חוזר.</w:t>
+            </w:r>
+          </w:p>
+        </w:tc>
+      </w:tr>
+      <w:tr>
+        <w:tc>
+          <w:tcPr>
+            <w:tcW w:type="dxa" w:w="1984"/>
+            <w:shd w:fill="F8F7F3"/>
+            <w:tcBorders>
+              <w:top w:val="single" w:sz="4" w:color="D8D5CC"/>
+              <w:left w:val="single" w:sz="4" w:color="D8D5CC"/>
+              <w:bottom w:val="single" w:sz="4" w:color="D8D5CC"/>
+              <w:right w:val="single" w:sz="4" w:color="D8D5CC"/>
+              <w:insideH w:val="single" w:sz="4" w:color="D8D5CC"/>
+              <w:insideV w:val="single" w:sz="4" w:color="D8D5CC"/>
+            </w:tcBorders>
+            <w:vAlign w:val="center"/>
+          </w:tcPr>
+          <w:p>
+            <w:pPr>
+              <w:spacing w:after="0"/>
+              <w:jc w:val="right"/>
+              <w:bidi w:val="1"/>
+            </w:pPr>
+            <w:r>
+              <w:rPr>
+                <w:rFonts w:ascii="Arial" w:hAnsi="Arial" w:cs="Arial"/>
+                <w:color w:val="242621"/>
+                <w:sz w:val="16"/>
+                <w:rtl/>
+              </w:rPr>
+              <w:t>ביטול חודשי</w:t>
+            </w:r>
+          </w:p>
+        </w:tc>
+        <w:tc>
+          <w:tcPr>
+            <w:tcW w:type="dxa" w:w="7200"/>
+            <w:shd w:fill="F8F7F3"/>
+            <w:tcBorders>
+              <w:top w:val="single" w:sz="4" w:color="D8D5CC"/>
+              <w:left w:val="single" w:sz="4" w:color="D8D5CC"/>
+              <w:bottom w:val="single" w:sz="4" w:color="D8D5CC"/>
+              <w:right w:val="single" w:sz="4" w:color="D8D5CC"/>
+              <w:insideH w:val="single" w:sz="4" w:color="D8D5CC"/>
+              <w:insideV w:val="single" w:sz="4" w:color="D8D5CC"/>
+            </w:tcBorders>
+            <w:vAlign w:val="center"/>
+          </w:tcPr>
+          <w:p>
+            <w:pPr>
+              <w:spacing w:after="0"/>
+              <w:jc w:val="right"/>
+              <w:bidi w:val="1"/>
+            </w:pPr>
+            <w:r>
+              <w:rPr>
+                <w:rFonts w:ascii="Arial" w:hAnsi="Arial" w:cs="Arial"/>
+                <w:color w:val="242621"/>
+                <w:sz w:val="16"/>
+                <w:rtl/>
+              </w:rPr>
+              <w:t>הביטול נכנס לתוקף בסוף התקופה שכבר שולמה; אין חיוב נוסף לאחר מכן.</w:t>
+            </w:r>
+          </w:p>
+        </w:tc>
+      </w:tr>
+      <w:tr>
+        <w:tc>
+          <w:tcPr>
+            <w:tcW w:type="dxa" w:w="1984"/>
+            <w:shd w:fill="FFFFFF"/>
+            <w:tcBorders>
+              <w:top w:val="single" w:sz="4" w:color="D8D5CC"/>
+              <w:left w:val="single" w:sz="4" w:color="D8D5CC"/>
+              <w:bottom w:val="single" w:sz="4" w:color="D8D5CC"/>
+              <w:right w:val="single" w:sz="4" w:color="D8D5CC"/>
+              <w:insideH w:val="single" w:sz="4" w:color="D8D5CC"/>
+              <w:insideV w:val="single" w:sz="4" w:color="D8D5CC"/>
+            </w:tcBorders>
+            <w:vAlign w:val="center"/>
+          </w:tcPr>
+          <w:p>
+            <w:pPr>
+              <w:spacing w:after="0"/>
+              <w:jc w:val="right"/>
+              <w:bidi w:val="1"/>
+            </w:pPr>
+            <w:r>
+              <w:rPr>
+                <w:rFonts w:ascii="Arial" w:hAnsi="Arial" w:cs="Arial"/>
+                <w:color w:val="242621"/>
+                <w:sz w:val="16"/>
+                <w:rtl/>
+              </w:rPr>
+              <w:t>ביטול שנתי</w:t>
+            </w:r>
+          </w:p>
+        </w:tc>
+        <w:tc>
+          <w:tcPr>
+            <w:tcW w:type="dxa" w:w="7200"/>
+            <w:shd w:fill="FFFFFF"/>
+            <w:tcBorders>
+              <w:top w:val="single" w:sz="4" w:color="D8D5CC"/>
+              <w:left w:val="single" w:sz="4" w:color="D8D5CC"/>
+              <w:bottom w:val="single" w:sz="4" w:color="D8D5CC"/>
+              <w:right w:val="single" w:sz="4" w:color="D8D5CC"/>
+              <w:insideH w:val="single" w:sz="4" w:color="D8D5CC"/>
+              <w:insideV w:val="single" w:sz="4" w:color="D8D5CC"/>
+            </w:tcBorders>
+            <w:vAlign w:val="center"/>
+          </w:tcPr>
+          <w:p>
+            <w:pPr>
+              <w:spacing w:after="0"/>
+              <w:jc w:val="right"/>
+              <w:bidi w:val="1"/>
+            </w:pPr>
+            <w:r>
+              <w:rPr>
+                <w:rFonts w:ascii="Arial" w:hAnsi="Arial" w:cs="Arial"/>
+                <w:color w:val="242621"/>
+                <w:sz w:val="16"/>
+                <w:rtl/>
+              </w:rPr>
+              <w:t>ביטול מוקדם כפוף לקנס היציאה המוגדר במערכת ולתיעוד אישור המשתמש.</w:t>
+            </w:r>
+          </w:p>
+        </w:tc>
+      </w:tr>
+      <w:tr>
+        <w:tc>
+          <w:tcPr>
+            <w:tcW w:type="dxa" w:w="1984"/>
+            <w:shd w:fill="F8F7F3"/>
+            <w:tcBorders>
+              <w:top w:val="single" w:sz="4" w:color="D8D5CC"/>
+              <w:left w:val="single" w:sz="4" w:color="D8D5CC"/>
+              <w:bottom w:val="single" w:sz="4" w:color="D8D5CC"/>
+              <w:right w:val="single" w:sz="4" w:color="D8D5CC"/>
+              <w:insideH w:val="single" w:sz="4" w:color="D8D5CC"/>
+              <w:insideV w:val="single" w:sz="4" w:color="D8D5CC"/>
+            </w:tcBorders>
+            <w:vAlign w:val="center"/>
+          </w:tcPr>
+          <w:p>
+            <w:pPr>
+              <w:spacing w:after="0"/>
+              <w:jc w:val="right"/>
+              <w:bidi w:val="1"/>
+            </w:pPr>
+            <w:r>
+              <w:rPr>
+                <w:rFonts w:ascii="Arial" w:hAnsi="Arial" w:cs="Arial"/>
+                <w:color w:val="242621"/>
+                <w:sz w:val="16"/>
+                <w:rtl/>
+              </w:rPr>
+              <w:t>החזר</w:t>
+            </w:r>
+          </w:p>
+        </w:tc>
+        <w:tc>
+          <w:tcPr>
+            <w:tcW w:type="dxa" w:w="7200"/>
+            <w:shd w:fill="F8F7F3"/>
+            <w:tcBorders>
+              <w:top w:val="single" w:sz="4" w:color="D8D5CC"/>
+              <w:left w:val="single" w:sz="4" w:color="D8D5CC"/>
+              <w:bottom w:val="single" w:sz="4" w:color="D8D5CC"/>
+              <w:right w:val="single" w:sz="4" w:color="D8D5CC"/>
+              <w:insideH w:val="single" w:sz="4" w:color="D8D5CC"/>
+              <w:insideV w:val="single" w:sz="4" w:color="D8D5CC"/>
+            </w:tcBorders>
+            <w:vAlign w:val="center"/>
+          </w:tcPr>
+          <w:p>
+            <w:pPr>
+              <w:spacing w:after="0"/>
+              <w:jc w:val="right"/>
+              <w:bidi w:val="1"/>
+            </w:pPr>
+            <w:r>
+              <w:rPr>
+                <w:rFonts w:ascii="Arial" w:hAnsi="Arial" w:cs="Arial"/>
+                <w:color w:val="242621"/>
+                <w:sz w:val="16"/>
+                <w:rtl/>
+              </w:rPr>
+              <w:t>החזר מבוצע רק לאחר אישור מנהל ונרשם כתנועת REFUNDED המקושרת לעסקה המקורית.</w:t>
+            </w:r>
+          </w:p>
+        </w:tc>
+      </w:tr>
+      <w:tr>
+        <w:tc>
+          <w:tcPr>
+            <w:tcW w:type="dxa" w:w="1984"/>
+            <w:shd w:fill="FFFFFF"/>
+            <w:tcBorders>
+              <w:top w:val="single" w:sz="4" w:color="D8D5CC"/>
+              <w:left w:val="single" w:sz="4" w:color="D8D5CC"/>
+              <w:bottom w:val="single" w:sz="4" w:color="D8D5CC"/>
+              <w:right w:val="single" w:sz="4" w:color="D8D5CC"/>
+              <w:insideH w:val="single" w:sz="4" w:color="D8D5CC"/>
+              <w:insideV w:val="single" w:sz="4" w:color="D8D5CC"/>
+            </w:tcBorders>
+            <w:vAlign w:val="center"/>
+          </w:tcPr>
+          <w:p>
+            <w:pPr>
+              <w:spacing w:after="0"/>
+              <w:jc w:val="right"/>
+              <w:bidi w:val="1"/>
+            </w:pPr>
+            <w:r>
+              <w:rPr>
+                <w:rFonts w:ascii="Arial" w:hAnsi="Arial" w:cs="Arial"/>
+                <w:color w:val="242621"/>
+                <w:sz w:val="16"/>
+                <w:rtl/>
+              </w:rPr>
+              <w:t>אבטחת מידע</w:t>
+            </w:r>
+          </w:p>
+        </w:tc>
+        <w:tc>
+          <w:tcPr>
+            <w:tcW w:type="dxa" w:w="7200"/>
+            <w:shd w:fill="FFFFFF"/>
+            <w:tcBorders>
+              <w:top w:val="single" w:sz="4" w:color="D8D5CC"/>
+              <w:left w:val="single" w:sz="4" w:color="D8D5CC"/>
+              <w:bottom w:val="single" w:sz="4" w:color="D8D5CC"/>
+              <w:right w:val="single" w:sz="4" w:color="D8D5CC"/>
+              <w:insideH w:val="single" w:sz="4" w:color="D8D5CC"/>
+              <w:insideV w:val="single" w:sz="4" w:color="D8D5CC"/>
+            </w:tcBorders>
+            <w:vAlign w:val="center"/>
+          </w:tcPr>
+          <w:p>
+            <w:pPr>
+              <w:spacing w:after="0"/>
+              <w:jc w:val="right"/>
+              <w:bidi w:val="1"/>
+            </w:pPr>
+            <w:r>
+              <w:rPr>
+                <w:rFonts w:ascii="Arial" w:hAnsi="Arial" w:cs="Arial"/>
+                <w:color w:val="242621"/>
+                <w:sz w:val="16"/>
+                <w:rtl/>
+              </w:rPr>
+              <w:t>אין לשמור מספר כרטיס מלא או CVV; נשמר רק מזהה מאובטח מספק הסליקה.</w:t>
+            </w:r>
+          </w:p>
+        </w:tc>
+      </w:tr>
+    </w:tbl>
+    <w:p>
+      <w:pPr>
+        <w:spacing w:after="20"/>
+      </w:pPr>
+    </w:p>
+    <w:tbl>
+      <w:tblPr>
+        <w:tblW w:type="auto" w:w="0"/>
+        <w:jc w:val="center"/>
         <w:tblLayout w:type="autofit"/>
         <w:tblLook w:firstColumn="1" w:firstRow="1" w:lastColumn="0" w:lastRow="0" w:noHBand="0" w:noVBand="1" w:val="04A0"/>
       </w:tblPr>
@@ -4728,7 +5771,7 @@
                 <w:sz w:val="20"/>
                 <w:rtl/>
               </w:rPr>
-              <w:t>לפני חיבור סליקה</w:t>
+              <w:t>הערת Production</w:t>
               <w:br/>
             </w:r>
             <w:r>
@@ -4738,7 +5781,7 @@
                 <w:sz w:val="18"/>
                 <w:rtl/>
               </w:rPr>
-              <w:t>יש לקבוע מחירים סופיים, מע״מ, תנאי החזר, אמצעי תשלום, חיוב מחזורי, קבלות, כשל חיוב ומדיניות ביטול עסקה.</w:t>
+              <w:t>כעת התשלום הוא סימולציה. חיבור סליקה אמיתי מחייב ספק סליקה, חשבוניות/קבלות, Webhooks לאישור ולכשל חיוב, מדיניות החזר מאושרת ובדיקת ייעוץ משפטי/חשבונאי.</w:t>
             </w:r>
           </w:p>
         </w:tc>
@@ -4770,7 +5813,7 @@
           <w:sz w:val="30"/>
           <w:rtl/>
         </w:rPr>
-        <w:t>11. החלטות לאישור לפני גרסת Production</w:t>
+        <w:t>11. החלטות שאושרו</w:t>
       </w:r>
     </w:p>
     <w:p>
@@ -4784,11 +5827,11 @@
         <w:rPr>
           <w:rFonts w:ascii="Arial" w:hAnsi="Arial" w:cs="Arial"/>
           <w:b/>
-          <w:color w:val="9A6A16"/>
+          <w:color w:val="2F765B"/>
           <w:sz w:val="20"/>
           <w:rtl/>
         </w:rPr>
-        <w:t xml:space="preserve">☐ </w:t>
+        <w:t xml:space="preserve">☑ </w:t>
       </w:r>
       <w:r>
         <w:rPr>
@@ -4797,7 +5840,7 @@
           <w:sz w:val="18"/>
           <w:rtl/>
         </w:rPr>
-        <w:t>גיל מינימלי לפתיחת חשבון עצמאי והאם קטין מחייב אישור הורה.</w:t>
+        <w:t>פתיחת חשבון עצמאי מגיל 16; צעירים יותר מצורפים באמצעות חשבון משפחתי.</w:t>
       </w:r>
     </w:p>
     <w:p>
@@ -4811,11 +5854,11 @@
         <w:rPr>
           <w:rFonts w:ascii="Arial" w:hAnsi="Arial" w:cs="Arial"/>
           <w:b/>
-          <w:color w:val="9A6A16"/>
+          <w:color w:val="2F765B"/>
           <w:sz w:val="20"/>
           <w:rtl/>
         </w:rPr>
-        <w:t xml:space="preserve">☐ </w:t>
+        <w:t xml:space="preserve">☑ </w:t>
       </w:r>
       <w:r>
         <w:rPr>
@@ -4824,7 +5867,7 @@
           <w:sz w:val="18"/>
           <w:rtl/>
         </w:rPr>
-        <w:t>תוקף הצהרת בריאות: חד־פעמי, שנתי או לפי שינוי רפואי.</w:t>
+        <w:t>הצהרת בריאות בתוקף לשנה בלבד; לאחר שנה נדרשת חתימה מחדש.</w:t>
       </w:r>
     </w:p>
     <w:p>
@@ -4838,11 +5881,11 @@
         <w:rPr>
           <w:rFonts w:ascii="Arial" w:hAnsi="Arial" w:cs="Arial"/>
           <w:b/>
-          <w:color w:val="9A6A16"/>
+          <w:color w:val="2F765B"/>
           <w:sz w:val="20"/>
           <w:rtl/>
         </w:rPr>
-        <w:t xml:space="preserve">☐ </w:t>
+        <w:t xml:space="preserve">☑ </w:t>
       </w:r>
       <w:r>
         <w:rPr>
@@ -4851,7 +5894,7 @@
           <w:sz w:val="18"/>
           <w:rtl/>
         </w:rPr>
-        <w:t>האם תאריך תפוגת מנוי חייב להיבדק בזמן הרשמה בנוסף לסטטוס ACTIVE.</w:t>
+        <w:t>תאריך תפוגת המנוי נבדק בכל הרשמה בנוסף לסטטוס המנוי.</w:t>
       </w:r>
     </w:p>
     <w:p>
@@ -4865,11 +5908,11 @@
         <w:rPr>
           <w:rFonts w:ascii="Arial" w:hAnsi="Arial" w:cs="Arial"/>
           <w:b/>
-          <w:color w:val="9A6A16"/>
+          <w:color w:val="2F765B"/>
           <w:sz w:val="20"/>
           <w:rtl/>
         </w:rPr>
-        <w:t xml:space="preserve">☐ </w:t>
+        <w:t xml:space="preserve">☑ </w:t>
       </w:r>
       <w:r>
         <w:rPr>
@@ -4878,7 +5921,7 @@
           <w:sz w:val="18"/>
           <w:rtl/>
         </w:rPr>
-        <w:t>האם מותר להירשם לשני אימונים חופפים באותה שעה.</w:t>
+        <w:t>אסור להירשם לשני אימונים או משבצות חופפים.</w:t>
       </w:r>
     </w:p>
     <w:p>
@@ -4892,11 +5935,11 @@
         <w:rPr>
           <w:rFonts w:ascii="Arial" w:hAnsi="Arial" w:cs="Arial"/>
           <w:b/>
-          <w:color w:val="9A6A16"/>
+          <w:color w:val="2F765B"/>
           <w:sz w:val="20"/>
           <w:rtl/>
         </w:rPr>
-        <w:t xml:space="preserve">☐ </w:t>
+        <w:t xml:space="preserve">☑ </w:t>
       </w:r>
       <w:r>
         <w:rPr>
@@ -4905,7 +5948,7 @@
           <w:sz w:val="18"/>
           <w:rtl/>
         </w:rPr>
-        <w:t>מקסימום אימונים ביום/שבוע לכל מסלול.</w:t>
+        <w:t>אין מגבלת כמות אימונים ביום או בשבוע, בכפוף לזכאות ולתפוסה.</w:t>
       </w:r>
     </w:p>
     <w:p>
@@ -4919,11 +5962,11 @@
         <w:rPr>
           <w:rFonts w:ascii="Arial" w:hAnsi="Arial" w:cs="Arial"/>
           <w:b/>
-          <w:color w:val="9A6A16"/>
+          <w:color w:val="2F765B"/>
           <w:sz w:val="20"/>
           <w:rtl/>
         </w:rPr>
-        <w:t xml:space="preserve">☐ </w:t>
+        <w:t xml:space="preserve">☑ </w:t>
       </w:r>
       <w:r>
         <w:rPr>
@@ -4932,7 +5975,7 @@
           <w:sz w:val="18"/>
           <w:rtl/>
         </w:rPr>
-        <w:t>האם לקבוע מכסת כניסות חודשית ל־Open Gym, מעבר להגבלת התפוסה בכל משבצת.</w:t>
+        <w:t>כללי Open Gym נקבעו לפי מפת הזכאות בסעיף 4.</w:t>
       </w:r>
     </w:p>
     <w:p>
@@ -4946,11 +5989,11 @@
         <w:rPr>
           <w:rFonts w:ascii="Arial" w:hAnsi="Arial" w:cs="Arial"/>
           <w:b/>
-          <w:color w:val="9A6A16"/>
+          <w:color w:val="2F765B"/>
           <w:sz w:val="20"/>
           <w:rtl/>
         </w:rPr>
-        <w:t xml:space="preserve">☐ </w:t>
+        <w:t xml:space="preserve">☑ </w:t>
       </w:r>
       <w:r>
         <w:rPr>
@@ -4959,7 +6002,7 @@
           <w:sz w:val="18"/>
           <w:rtl/>
         </w:rPr>
-        <w:t>סדר רשימת המתנה: זמן הצטרפות, עדיפות או שילוב.</w:t>
+        <w:t>רשימת ההמתנה פועלת לפי זמן ההצטרפות — כל הקודם זוכה.</w:t>
       </w:r>
     </w:p>
     <w:p>
@@ -4973,11 +6016,11 @@
         <w:rPr>
           <w:rFonts w:ascii="Arial" w:hAnsi="Arial" w:cs="Arial"/>
           <w:b/>
-          <w:color w:val="9A6A16"/>
+          <w:color w:val="2F765B"/>
           <w:sz w:val="20"/>
           <w:rtl/>
         </w:rPr>
-        <w:t xml:space="preserve">☐ </w:t>
+        <w:t xml:space="preserve">☑ </w:t>
       </w:r>
       <w:r>
         <w:rPr>
@@ -4986,7 +6029,7 @@
           <w:sz w:val="18"/>
           <w:rtl/>
         </w:rPr>
-        <w:t>ערוץ הודעה בקידום מהמתנה: SMS, WhatsApp, Push או כולם.</w:t>
+        <w:t>PUSH כולל קידום מהמתנה ותזכורות אימון, עם אפשרות הפעלה וביטול.</w:t>
       </w:r>
     </w:p>
     <w:p>
@@ -5000,11 +6043,11 @@
         <w:rPr>
           <w:rFonts w:ascii="Arial" w:hAnsi="Arial" w:cs="Arial"/>
           <w:b/>
-          <w:color w:val="9A6A16"/>
+          <w:color w:val="2F765B"/>
           <w:sz w:val="20"/>
           <w:rtl/>
         </w:rPr>
-        <w:t xml:space="preserve">☐ </w:t>
+        <w:t xml:space="preserve">☑ </w:t>
       </w:r>
       <w:r>
         <w:rPr>
@@ -5013,7 +6056,7 @@
           <w:sz w:val="18"/>
           <w:rtl/>
         </w:rPr>
-        <w:t>חלון ביטול קבוצתי סופי והאם הוא אחיד לכל סוגי האימון.</w:t>
+        <w:t>מנהל יכול להפעיל PUSH עבור הודעות ופניות שמופנות אליו.</w:t>
       </w:r>
     </w:p>
     <w:p>
@@ -5027,11 +6070,11 @@
         <w:rPr>
           <w:rFonts w:ascii="Arial" w:hAnsi="Arial" w:cs="Arial"/>
           <w:b/>
-          <w:color w:val="9A6A16"/>
+          <w:color w:val="2F765B"/>
           <w:sz w:val="20"/>
           <w:rtl/>
         </w:rPr>
-        <w:t xml:space="preserve">☐ </w:t>
+        <w:t xml:space="preserve">☑ </w:t>
       </w:r>
       <w:r>
         <w:rPr>
@@ -5040,7 +6083,7 @@
           <w:sz w:val="18"/>
           <w:rtl/>
         </w:rPr>
-        <w:t>מדיניות No-show: נקודה, חיוב, חסימת הרשמות או שילוב.</w:t>
+        <w:t>חלון הביטול אחיד: שעתיים לכל סוגי האימון.</w:t>
       </w:r>
     </w:p>
     <w:p>
@@ -5054,11 +6097,11 @@
         <w:rPr>
           <w:rFonts w:ascii="Arial" w:hAnsi="Arial" w:cs="Arial"/>
           <w:b/>
-          <w:color w:val="9A6A16"/>
+          <w:color w:val="2F765B"/>
           <w:sz w:val="20"/>
           <w:rtl/>
         </w:rPr>
-        <w:t xml:space="preserve">☐ </w:t>
+        <w:t xml:space="preserve">☑ </w:t>
       </w:r>
       <w:r>
         <w:rPr>
@@ -5067,7 +6110,7 @@
           <w:sz w:val="18"/>
           <w:rtl/>
         </w:rPr>
-        <w:t>מדיניות משפחות: מי רשאי לשנות/לבטל מנויים של בני משפחה.</w:t>
+        <w:t>אי־הגעה ממשיכה ליצור נקודה שחורה אוטומטית.</w:t>
       </w:r>
     </w:p>
     <w:p>
@@ -5081,11 +6124,11 @@
         <w:rPr>
           <w:rFonts w:ascii="Arial" w:hAnsi="Arial" w:cs="Arial"/>
           <w:b/>
-          <w:color w:val="9A6A16"/>
+          <w:color w:val="2F765B"/>
           <w:sz w:val="20"/>
           <w:rtl/>
         </w:rPr>
-        <w:t xml:space="preserve">☐ </w:t>
+        <w:t xml:space="preserve">☑ </w:t>
       </w:r>
       <w:r>
         <w:rPr>
@@ -5094,7 +6137,34 @@
           <w:sz w:val="18"/>
           <w:rtl/>
         </w:rPr>
-        <w:t>מדיניות פרטיות ושמירת מידע רפואי, סיסמאות ונתוני תשלום.</w:t>
+        <w:t>כל אחד מבני המשפחה רשאי לנהל, לשנות או לבטל מסלולים בחשבון המשפחתי.</w:t>
+      </w:r>
+    </w:p>
+    <w:p>
+      <w:pPr>
+        <w:spacing w:after="50"/>
+        <w:ind w:right="113"/>
+        <w:jc w:val="right"/>
+        <w:bidi w:val="1"/>
+      </w:pPr>
+      <w:r>
+        <w:rPr>
+          <w:rFonts w:ascii="Arial" w:hAnsi="Arial" w:cs="Arial"/>
+          <w:b/>
+          <w:color w:val="2F765B"/>
+          <w:sz w:val="20"/>
+          <w:rtl/>
+        </w:rPr>
+        <w:t xml:space="preserve">☑ </w:t>
+      </w:r>
+      <w:r>
+        <w:rPr>
+          <w:rFonts w:ascii="Arial" w:hAnsi="Arial" w:cs="Arial"/>
+          <w:color w:val="242621"/>
+          <w:sz w:val="18"/>
+          <w:rtl/>
+        </w:rPr>
+        <w:t>חתימה על הסכם ההצטרפות, התקנון, הביטולים והפרטיות היא חלק חובה מההרשמה.</w:t>
       </w:r>
     </w:p>
     <w:p>
@@ -5413,6 +6483,141 @@
         <w:t>כרטיסייה יורדת בהרשמה וחוזרת רק בביטול בזמן.</w:t>
       </w:r>
     </w:p>
+    <w:p>
+      <w:pPr>
+        <w:spacing w:after="50"/>
+        <w:ind w:right="113"/>
+        <w:jc w:val="right"/>
+        <w:bidi w:val="1"/>
+      </w:pPr>
+      <w:r>
+        <w:rPr>
+          <w:rFonts w:ascii="Arial" w:hAnsi="Arial" w:cs="Arial"/>
+          <w:b/>
+          <w:color w:val="2F765B"/>
+          <w:sz w:val="20"/>
+          <w:rtl/>
+        </w:rPr>
+        <w:t xml:space="preserve">☑ </w:t>
+      </w:r>
+      <w:r>
+        <w:rPr>
+          <w:rFonts w:ascii="Arial" w:hAnsi="Arial" w:cs="Arial"/>
+          <w:color w:val="242621"/>
+          <w:sz w:val="18"/>
+          <w:rtl/>
+        </w:rPr>
+        <w:t>הצהרה חסרה/שפג תוקפה חוסמת אימונים וחתימה מחדש פותחת את ההרשמה.</w:t>
+      </w:r>
+    </w:p>
+    <w:p>
+      <w:pPr>
+        <w:spacing w:after="50"/>
+        <w:ind w:right="113"/>
+        <w:jc w:val="right"/>
+        <w:bidi w:val="1"/>
+      </w:pPr>
+      <w:r>
+        <w:rPr>
+          <w:rFonts w:ascii="Arial" w:hAnsi="Arial" w:cs="Arial"/>
+          <w:b/>
+          <w:color w:val="2F765B"/>
+          <w:sz w:val="20"/>
+          <w:rtl/>
+        </w:rPr>
+        <w:t xml:space="preserve">☑ </w:t>
+      </w:r>
+      <w:r>
+        <w:rPr>
+          <w:rFonts w:ascii="Arial" w:hAnsi="Arial" w:cs="Arial"/>
+          <w:color w:val="242621"/>
+          <w:sz w:val="18"/>
+          <w:rtl/>
+        </w:rPr>
+        <w:t>מנוי שפג תוקפו או אימון חופף נחסמים.</w:t>
+      </w:r>
+    </w:p>
+    <w:p>
+      <w:pPr>
+        <w:spacing w:after="50"/>
+        <w:ind w:right="113"/>
+        <w:jc w:val="right"/>
+        <w:bidi w:val="1"/>
+      </w:pPr>
+      <w:r>
+        <w:rPr>
+          <w:rFonts w:ascii="Arial" w:hAnsi="Arial" w:cs="Arial"/>
+          <w:b/>
+          <w:color w:val="2F765B"/>
+          <w:sz w:val="20"/>
+          <w:rtl/>
+        </w:rPr>
+        <w:t xml:space="preserve">☑ </w:t>
+      </w:r>
+      <w:r>
+        <w:rPr>
+          <w:rFonts w:ascii="Arial" w:hAnsi="Arial" w:cs="Arial"/>
+          <w:color w:val="242621"/>
+          <w:sz w:val="18"/>
+          <w:rtl/>
+        </w:rPr>
+        <w:t>סדר ההמתנה נשמר לפי זמן ההצטרפות.</w:t>
+      </w:r>
+    </w:p>
+    <w:p>
+      <w:pPr>
+        <w:spacing w:after="50"/>
+        <w:ind w:right="113"/>
+        <w:jc w:val="right"/>
+        <w:bidi w:val="1"/>
+      </w:pPr>
+      <w:r>
+        <w:rPr>
+          <w:rFonts w:ascii="Arial" w:hAnsi="Arial" w:cs="Arial"/>
+          <w:b/>
+          <w:color w:val="2F765B"/>
+          <w:sz w:val="20"/>
+          <w:rtl/>
+        </w:rPr>
+        <w:t xml:space="preserve">☑ </w:t>
+      </w:r>
+      <w:r>
+        <w:rPr>
+          <w:rFonts w:ascii="Arial" w:hAnsi="Arial" w:cs="Arial"/>
+          <w:color w:val="242621"/>
+          <w:sz w:val="18"/>
+          <w:rtl/>
+        </w:rPr>
+        <w:t>ניתן להפעיל ולבטל PUSH ותזכורות; למנהל קיימת העדפת PUSH לפניות.</w:t>
+      </w:r>
+    </w:p>
+    <w:p>
+      <w:pPr>
+        <w:spacing w:after="50"/>
+        <w:ind w:right="113"/>
+        <w:jc w:val="right"/>
+        <w:bidi w:val="1"/>
+      </w:pPr>
+      <w:r>
+        <w:rPr>
+          <w:rFonts w:ascii="Arial" w:hAnsi="Arial" w:cs="Arial"/>
+          <w:b/>
+          <w:color w:val="2F765B"/>
+          <w:sz w:val="20"/>
+          <w:rtl/>
+        </w:rPr>
+        <w:t xml:space="preserve">☑ </w:t>
+      </w:r>
+      <w:r>
+        <w:rPr>
+          <w:rFonts w:ascii="Arial" w:hAnsi="Arial" w:cs="Arial"/>
+          <w:color w:val="242621"/>
+          <w:sz w:val="18"/>
+          <w:rtl/>
+        </w:rPr>
+        <w:t>ההרשמה כוללת חתימה על הסכם המועדון.</w:t>
+      </w:r>
+    </w:p>
     <w:tbl>
       <w:tblPr>
         <w:tblW w:type="auto" w:w="0"/>
@@ -5462,7 +6667,7 @@
                 <w:sz w:val="18"/>
                 <w:rtl/>
               </w:rPr>
-              <w:t>לאחר אישור יתר ההחלטות בסעיף 11, יש לעדכן את כללי הצהרת הבריאות, לחבר ספק SMS וספק סליקה, ולהריץ את סעיף 12 כבדיקות קבלה לפני פרסום לציבור.</w:t>
+              <w:t>ההחלטות העסקיות שסופקו עודכנו במערכת. לפני פרסום ציבורי נותר לחבר ספקי SMS, PUSH וסליקה, להשלים Service Worker ולבצע בדיקות אבטחה וייעוץ משפטי/חשבונאי להסכמים ולמדיניות התשלום.</w:t>
             </w:r>
           </w:p>
         </w:tc>

</xml_diff>